<commit_message>
doc: added another report update
</commit_message>
<xml_diff>
--- a/docs/capstone_comparative_benchmarking_report.docx
+++ b/docs/capstone_comparative_benchmarking_report.docx
@@ -77,7 +77,7 @@
                 <w:color w:val="222222"/>
                 <w:sz w:val="18"/>
               </w:rPr>
-              <w:t>B.Tech Final Year Capstone Project (2nd Review)</w:t>
+              <w:t>B.Tech Final Year Capstone Project</w:t>
             </w:r>
           </w:p>
         </w:tc>
@@ -175,7 +175,7 @@
                 <w:color w:val="222222"/>
                 <w:sz w:val="18"/>
               </w:rPr>
-              <w:t>Interim Technical Report (Aligned with Table 5.2.5 Rubrics)</w:t>
+              <w:t>Technical Engineering Report</w:t>
             </w:r>
           </w:p>
         </w:tc>
@@ -209,7 +209,7 @@
                 <w:color w:val="222222"/>
                 <w:sz w:val="18"/>
               </w:rPr>
-              <w:t>Krishna Shah, Aditya Rana, Parth Surve</w:t>
+              <w:t>Krishna Menon, Aditya Rana, Parth Surve</w:t>
             </w:r>
           </w:p>
         </w:tc>
@@ -234,14 +234,14 @@
                 <w:color w:val="1B365D"/>
                 <w:sz w:val="18"/>
               </w:rPr>
-              <w:t xml:space="preserve">Review Milestone: </w:t>
+              <w:t xml:space="preserve">Institution: </w:t>
             </w:r>
             <w:r>
               <w:rPr>
                 <w:color w:val="222222"/>
                 <w:sz w:val="18"/>
               </w:rPr>
-              <w:t>2nd Review Evaluation — Max Marks: 25</w:t>
+              <w:t>NMIMS MPSTME — Autonomous Robotics</w:t>
             </w:r>
           </w:p>
         </w:tc>
@@ -250,128 +250,6 @@
     <w:p>
       <w:pPr>
         <w:spacing w:after="120"/>
-      </w:pPr>
-    </w:p>
-    <w:tbl>
-      <w:tblPr>
-        <w:tblW w:type="auto" w:w="0"/>
-        <w:jc w:val="center"/>
-        <w:tblLook w:firstColumn="1" w:firstRow="1" w:lastColumn="0" w:lastRow="0" w:noHBand="0" w:noVBand="1" w:val="04A0"/>
-      </w:tblPr>
-      <w:tblGrid>
-        <w:gridCol w:w="9360"/>
-      </w:tblGrid>
-      <w:tr>
-        <w:tc>
-          <w:tcPr>
-            <w:tcW w:type="dxa" w:w="9360"/>
-            <w:shd w:fill="F0F9F4"/>
-            <w:tcMar>
-              <w:top w:w="130" w:type="dxa"/>
-              <w:bottom w:w="130" w:type="dxa"/>
-              <w:left w:w="180" w:type="dxa"/>
-              <w:right w:w="160" w:type="dxa"/>
-            </w:tcMar>
-            <w:tcBorders>
-              <w:left w:val="single" w:sz="24" w:space="0" w:color="1B7A43"/>
-              <w:top w:val="none"/>
-              <w:bottom w:val="none"/>
-              <w:right w:val="none"/>
-            </w:tcBorders>
-          </w:tcPr>
-          <w:p>
-            <w:pPr>
-              <w:spacing w:before="40" w:after="80" w:line="276" w:lineRule="auto"/>
-            </w:pPr>
-            <w:r>
-              <w:rPr>
-                <w:rFonts w:ascii="Calibri" w:hAnsi="Calibri"/>
-                <w:b/>
-                <w:color w:val="1B365D"/>
-                <w:sz w:val="21"/>
-              </w:rPr>
-              <w:t xml:space="preserve">📌 2ND REVIEW RUBRIC COMPLIANCE MATRIX (25/25 TARGET): </w:t>
-            </w:r>
-            <w:r>
-              <w:rPr>
-                <w:rFonts w:ascii="Calibri" w:hAnsi="Calibri"/>
-                <w:color w:val="222222"/>
-                <w:sz w:val="20"/>
-              </w:rPr>
-              <w:t>Rubric Alignment Index (Table 5.2.5 — 2nd Review):</w:t>
-            </w:r>
-          </w:p>
-          <w:p>
-            <w:pPr>
-              <w:spacing w:before="40" w:after="40" w:line="276" w:lineRule="auto"/>
-            </w:pPr>
-            <w:r>
-              <w:rPr>
-                <w:rFonts w:ascii="Calibri" w:hAnsi="Calibri"/>
-                <w:color w:val="222222"/>
-                <w:sz w:val="20"/>
-              </w:rPr>
-              <w:t>• Parameter A [Literature Review &amp; Market Survey]: Section 2 presents a 6-platform comparative matrix (JetBot, DonkeyCar, JetRacer, OpenBot, PiCar-X, Our Car) and cites IEEE/IROS publications.</w:t>
-            </w:r>
-          </w:p>
-          <w:p>
-            <w:pPr>
-              <w:spacing w:before="40" w:after="40" w:line="276" w:lineRule="auto"/>
-            </w:pPr>
-            <w:r>
-              <w:rPr>
-                <w:rFonts w:ascii="Calibri" w:hAnsi="Calibri"/>
-                <w:color w:val="222222"/>
-                <w:sz w:val="20"/>
-              </w:rPr>
-              <w:t>• Parameter B [Clarity of Problem Statement &amp; Gaps]: Section 1 formalizes 3 specific research gaps (Linux PWM jitter, acoustic negative obstacle blindness, Indian market cost inflation).</w:t>
-            </w:r>
-          </w:p>
-          <w:p>
-            <w:pPr>
-              <w:spacing w:before="40" w:after="40" w:line="276" w:lineRule="auto"/>
-            </w:pPr>
-            <w:r>
-              <w:rPr>
-                <w:rFonts w:ascii="Calibri" w:hAnsi="Calibri"/>
-                <w:color w:val="222222"/>
-                <w:sz w:val="20"/>
-              </w:rPr>
-              <w:t>• Parameter C [Design &amp; System Representation]: Section 3 &amp; 4 provide complete electrical diagrams, Mermaid state machines, and mathematical formulas for danger and tracking.</w:t>
-            </w:r>
-          </w:p>
-          <w:p>
-            <w:pPr>
-              <w:spacing w:before="40" w:after="40" w:line="276" w:lineRule="auto"/>
-            </w:pPr>
-            <w:r>
-              <w:rPr>
-                <w:rFonts w:ascii="Calibri" w:hAnsi="Calibri"/>
-                <w:color w:val="222222"/>
-                <w:sz w:val="20"/>
-              </w:rPr>
-              <w:t>• Parameter D [Implementation &amp; Results (&gt;50% Complete)]: Section 6 documents physical firmware verification, 50-epoch RDD2022 pothole training loss curves, and measured 22–26ms NCNN latency.</w:t>
-            </w:r>
-          </w:p>
-          <w:p>
-            <w:pPr>
-              <w:spacing w:before="40" w:after="40" w:line="276" w:lineRule="auto"/>
-            </w:pPr>
-            <w:r>
-              <w:rPr>
-                <w:rFonts w:ascii="Calibri" w:hAnsi="Calibri"/>
-                <w:color w:val="222222"/>
-                <w:sz w:val="20"/>
-              </w:rPr>
-              <w:t>• Parameter E [Interim Report, Realistic BOM &amp; Future Scope]: Section 5 updates Raspberry Pi 5 to accurate Indian market value (₹15,500–₹16,000 INR) with college lab asset offsetting; Section 7 outlines technical dependencies and future extensions.</w:t>
-            </w:r>
-          </w:p>
-        </w:tc>
-      </w:tr>
-    </w:tbl>
-    <w:p>
-      <w:pPr>
-        <w:spacing w:after="80"/>
       </w:pPr>
     </w:p>
     <w:p>
@@ -386,7 +264,7 @@
           <w:color w:val="1B365D"/>
           <w:sz w:val="30"/>
         </w:rPr>
-        <w:t>1. Executive Summary &amp; Problem Formulation [Rubric B: Problem Statement &amp; Research Gaps]</w:t>
+        <w:t>1. Executive Summary &amp; Problem Formulation</w:t>
       </w:r>
     </w:p>
     <w:p>
@@ -641,7 +519,7 @@
           <w:color w:val="1B365D"/>
           <w:sz w:val="30"/>
         </w:rPr>
-        <w:t>2. Literature Review &amp; Comprehensive Market Survey [Rubric A: Understanding of Existing Research]</w:t>
+        <w:t>2. Literature Review &amp; Comparative Market Survey</w:t>
       </w:r>
     </w:p>
     <w:p>
@@ -2115,7 +1993,7 @@
           <w:color w:val="1B365D"/>
           <w:sz w:val="30"/>
         </w:rPr>
-        <w:t>3. System Design &amp; Architectural Representation [Rubric C: Architecture &amp; Algorithms]</w:t>
+        <w:t>3. System Architecture &amp; Hardware Topology</w:t>
       </w:r>
     </w:p>
     <w:p>
@@ -3890,7 +3768,7 @@
           <w:color w:val="1B365D"/>
           <w:sz w:val="30"/>
         </w:rPr>
-        <w:t>5. Economic Feasibility &amp; Bill of Materials (BOM) [Rubric E: Technical Requirements &amp; Real Costs]</w:t>
+        <w:t>5. Economic Feasibility &amp; Bill of Materials (BOM)</w:t>
       </w:r>
     </w:p>
     <w:p>
@@ -5357,7 +5235,7 @@
           <w:color w:val="1B365D"/>
           <w:sz w:val="30"/>
         </w:rPr>
-        <w:t>6. Implementation Progress &amp; Empirical Results [Rubric D: &gt;50% Completed Work]</w:t>
+        <w:t>6. Implementation Status &amp; Empirical Results</w:t>
       </w:r>
     </w:p>
     <w:p>
@@ -5383,7 +5261,7 @@
           <w:color w:val="222222"/>
           <w:sz w:val="21"/>
         </w:rPr>
-        <w:t>In compliance with Rubric D (&gt;50% completed implementation), more than 65% of the total project engineering work has been completed, physically deployed, and benchmarked across both layers:</w:t>
+        <w:t>Over 65% of the total project engineering work has been completed, physically deployed, and benchmarked across both layers:</w:t>
       </w:r>
     </w:p>
     <w:tbl>
@@ -6128,7 +6006,7 @@
           <w:color w:val="1B365D"/>
           <w:sz w:val="30"/>
         </w:rPr>
-        <w:t>7. Technical Requirements &amp; Future Project Extensions [Rubric E: Future Extensions]</w:t>
+        <w:t>7. Technical Specifications &amp; Planned Autonomy Roadmap</w:t>
       </w:r>
     </w:p>
     <w:p>
@@ -6262,7 +6140,7 @@
           <w:color w:val="2E5B88"/>
           <w:sz w:val="25"/>
         </w:rPr>
-        <w:t>7.2 Prioritized Future Extensions Roadmap</w:t>
+        <w:t>7.2 Core Autonomy Integration Roadmap</w:t>
       </w:r>
     </w:p>
     <w:p>
@@ -6277,7 +6155,7 @@
           <w:color w:val="222222"/>
           <w:sz w:val="20"/>
         </w:rPr>
-        <w:t xml:space="preserve">1. Traffic Sign Recognition Integration (Option B): </w:t>
+        <w:t xml:space="preserve">1. Negative Obstacle &amp; Pothole Avoidance Integration: </w:t>
       </w:r>
       <w:r>
         <w:rPr>
@@ -6285,7 +6163,7 @@
           <w:color w:val="222222"/>
           <w:sz w:val="20"/>
         </w:rPr>
-        <w:t>Integrate a Two-Stage Hierarchical Pipeline combining an upper-ROI color/geometry gate (&lt;2 ms) with an NCNN MobileNetV4-Small classifier (&lt;3.5 ms) to recognize 6 IRC track signs (go, right, park, red, green, crosswalk). This decoupled design ensures zero regression to obstacle avoidance.</w:t>
+        <w:t>Deploy the fine-tuned RDD2022 YOLOv8n model (rdd2022_yolov8n.pt) and the &lt;4 ms Laplacian CV fallback directly into the live perception loop on the vehicle. Validate the trapezoidal driving corridor and dynamic swerve arbitration (SWERVE_LEFT, SWERVE_RIGHT, PI_STOP) across physical road cavities and surface defects.</w:t>
       </w:r>
     </w:p>
     <w:p>
@@ -6300,7 +6178,7 @@
           <w:color w:val="222222"/>
           <w:sz w:val="20"/>
         </w:rPr>
-        <w:t xml:space="preserve">2. IMU-Aided Yaw Dead-Reckoning (MPU-6050): </w:t>
+        <w:t xml:space="preserve">2. Vision-Based Lane Following: </w:t>
       </w:r>
       <w:r>
         <w:rPr>
@@ -6308,7 +6186,7 @@
           <w:color w:val="222222"/>
           <w:sz w:val="20"/>
         </w:rPr>
-        <w:t>Integrate an MPU-6050 6-DOF IMU on the Arduino I2C bus to measure true angular turning yaw, eliminating skid-steer wheel-slip drift during avoidance maneuvers.</w:t>
+        <w:t>Integrate the classical multi-ROI perspective lane detector (lane_detector.py) to extract road boundaries in CIE LAB space (&lt;4 ms) without deep learning compute overhead. Couple the angular steering error theta = arctan(dx/dy) to the discrete PID controller (pid.py) for closed-loop centerline tracking.</w:t>
       </w:r>
     </w:p>
     <w:p>
@@ -6323,7 +6201,7 @@
           <w:color w:val="222222"/>
           <w:sz w:val="20"/>
         </w:rPr>
-        <w:t xml:space="preserve">3. Arduino Nano Hardware Form-Factor Migration: </w:t>
+        <w:t xml:space="preserve">3. Track Traffic Sign &amp; Signal Recognition: </w:t>
       </w:r>
       <w:r>
         <w:rPr>
@@ -6331,7 +6209,7 @@
           <w:color w:val="222222"/>
           <w:sz w:val="20"/>
         </w:rPr>
-        <w:t>Migrate from the Uno R3 to an Arduino Nano (identical ATmega328P core, pinout, and timer registers), reducing microcontroller chassis footprint by 70%.</w:t>
+        <w:t>Integrate the 6-class traffic sign state machine (traffic_signs.py) with the pre-trained weights (traffic_signs_640s_7_0.pt). The temporal 5-frame debounce filter and upper-ROI spatial gating will enable reliable intersection handling (red stop latch, green release, right turn execution, and timed crosswalk speed modulation) without degrading real-time obstacle avoidance.</w:t>
       </w:r>
     </w:p>
     <w:p>
@@ -6346,7 +6224,7 @@
           <w:color w:val="1B365D"/>
           <w:sz w:val="30"/>
         </w:rPr>
-        <w:t>8. Formal Academic References [Rubric A: Citable Sources]</w:t>
+        <w:t>8. Formal Academic References</w:t>
       </w:r>
     </w:p>
     <w:p>
@@ -6498,7 +6376,7 @@
           <w:color w:val="222222"/>
           <w:sz w:val="18"/>
         </w:rPr>
-        <w:t>[10] P. Surve, A. Rana, and K. Shah, "Two-Layer Heterogeneous System Architecture and Serial Telemetry Protocol for Autonomous RC Vehicles," Capstone Documentation, NMIMS MPSTME, 2026.</w:t>
+        <w:t>[10] P. Surve, A. Rana, and K. Menon, "Two-Layer Heterogeneous System Architecture and Serial Telemetry Protocol for Autonomous RC Vehicles," Capstone Documentation, NMIMS MPSTME, 2026.</w:t>
       </w:r>
     </w:p>
     <w:sectPr>

</xml_diff>

<commit_message>
feat: add live evaluation demo suite, edge benchmarking, and review presentation materials
- Add demo_live.py with unified YOLOv10n obstacle detection and high-recall pothole avoidance
- Add dedicated demo_pothole_live.py and demo_yolov10_live.py standalone evaluation scripts
- Add benchmark.py multi-runtime edge benchmarking suite (PyTorch, NCNN, ONNX, OpenVINO)
- Update capstone presentation (.pptx) with real training curves, perception HUDs, and YOLOv10n telemetry
- Reorganize presentation generator tools into tools/presentation/
- Add slide screenshots to docs/reports/screenshots/ and update .gitignore
</commit_message>
<xml_diff>
--- a/docs/capstone_comparative_benchmarking_report.docx
+++ b/docs/capstone_comparative_benchmarking_report.docx
@@ -481,7 +481,7 @@
           <w:color w:val="222222"/>
           <w:sz w:val="20"/>
         </w:rPr>
-        <w:t>Formulate and train a dual-modality perception engine combining a fine-tuned RDD2022 YOLOv8n deep model with an ultra-lightweight (&lt;4 ms) classical Laplacian CV fallback to detect negative obstacles (potholes) invisible to sonar.</w:t>
+        <w:t>Formulate and train a dual-modality perception engine combining a fine-tuned RDD2022 YOLOv10n deep model with an ultra-lightweight (&lt;4 ms) classical Laplacian CV fallback to detect negative obstacles (potholes) invisible to sonar.</w:t>
       </w:r>
     </w:p>
     <w:p>
@@ -3588,7 +3588,7 @@
           <w:color w:val="222222"/>
           <w:sz w:val="20"/>
         </w:rPr>
-        <w:t xml:space="preserve">Deep Learning Path (Custom RDD2022 YOLOv8n): </w:t>
+        <w:t xml:space="preserve">Deep Learning Path (Custom RDD2022 YOLOv10n): </w:t>
       </w:r>
       <w:r>
         <w:rPr>
@@ -5635,7 +5635,7 @@
                 <w:rFonts w:ascii="Calibri" w:hAnsi="Calibri"/>
                 <w:sz w:val="16"/>
               </w:rPr>
-              <w:t>best.pt, rdd2022_yolov8n.pt, run_detection.py (50 epochs on RDD2022)</w:t>
+              <w:t>best.pt, run_detection.py (50 epochs on RDD2022)</w:t>
             </w:r>
           </w:p>
         </w:tc>
@@ -6163,7 +6163,7 @@
           <w:color w:val="222222"/>
           <w:sz w:val="20"/>
         </w:rPr>
-        <w:t>Deploy the fine-tuned RDD2022 YOLOv8n model (rdd2022_yolov8n.pt) and the &lt;4 ms Laplacian CV fallback directly into the live perception loop on the vehicle. Validate the trapezoidal driving corridor and dynamic swerve arbitration (SWERVE_LEFT, SWERVE_RIGHT, PI_STOP) across physical road cavities and surface defects.</w:t>
+        <w:t>Deploy the fine-tuned RDD2022 YOLOv10n model (rdd2022_yolov8n.pt) and the &lt;4 ms Laplacian CV fallback directly into the live perception loop on the vehicle. Validate the trapezoidal driving corridor and dynamic swerve arbitration (SWERVE_LEFT, SWERVE_RIGHT, PI_STOP) across physical road cavities and surface defects.</w:t>
       </w:r>
     </w:p>
     <w:p>

</xml_diff>